<commit_message>
fix: name-based category inference + sharper CLIP prompts for beverages/dairy/snacks
</commit_message>
<xml_diff>
--- a/Retail_AI_Capstone_Report.docx
+++ b/Retail_AI_Capstone_Report.docx
@@ -12162,6 +12162,84 @@
           </w:p>
         </w:tc>
       </w:tr>
+      <w:tr>
+        <w:tc>
+          <w:tcPr>
+            <w:tcW w:type="dxa" w:w="800"/>
+            <w:shd w:fill="FFFFFF" w:color="auto" w:val="clear"/>
+            <w:vAlign w:val="center"/>
+          </w:tcPr>
+          <w:p>
+            <w:pPr>
+              <w:spacing w:after="30" w:before="30"/>
+            </w:pPr>
+            <w:r>
+              <w:rPr>
+                <w:sz w:val="20"/>
+                <w:szCs w:val="20"/>
+              </w:rPr>
+              <w:t xml:space="preserve">v2.0</w:t>
+            </w:r>
+          </w:p>
+        </w:tc>
+        <w:tc>
+          <w:tcPr>
+            <w:tcW w:type="dxa" w:w="2400"/>
+            <w:shd w:fill="FFFFFF" w:color="auto" w:val="clear"/>
+            <w:vAlign w:val="center"/>
+          </w:tcPr>
+          <w:p>
+            <w:pPr>
+              <w:spacing w:after="30" w:before="30"/>
+            </w:pPr>
+            <w:r>
+              <w:rPr>
+                <w:sz w:val="20"/>
+                <w:szCs w:val="20"/>
+              </w:rPr>
+              <w:t xml:space="preserve">Name-based category inference + improved CLIP prompts</w:t>
+            </w:r>
+          </w:p>
+        </w:tc>
+        <w:tc>
+          <w:tcPr>
+            <w:tcW w:type="dxa" w:w="2800"/>
+            <w:shd w:fill="FFFFFF" w:color="auto" w:val="clear"/>
+            <w:vAlign w:val="center"/>
+          </w:tcPr>
+          <w:p>
+            <w:pPr>
+              <w:spacing w:after="30" w:before="30"/>
+            </w:pPr>
+            <w:r>
+              <w:rPr>
+                <w:sz w:val="20"/>
+                <w:szCs w:val="20"/>
+              </w:rPr>
+              <w:t xml:space="preserve">detection.py</w:t>
+            </w:r>
+          </w:p>
+        </w:tc>
+        <w:tc>
+          <w:tcPr>
+            <w:tcW w:type="dxa" w:w="3360"/>
+            <w:shd w:fill="FFFFFF" w:color="auto" w:val="clear"/>
+            <w:vAlign w:val="center"/>
+          </w:tcPr>
+          <w:p>
+            <w:pPr>
+              <w:spacing w:after="30" w:before="30"/>
+            </w:pPr>
+            <w:r>
+              <w:rPr>
+                <w:sz w:val="20"/>
+                <w:szCs w:val="20"/>
+              </w:rPr>
+              <w:t xml:space="preserve">_infer_category_from_name() derives category from product name when planogram or library identifies the product, replacing unreliable CLIP Stage 2 guesses on small crops. Beverage, dairy, and snack CLIP prompts also sharpened with brand-specific visual descriptors.</w:t>
+            </w:r>
+          </w:p>
+        </w:tc>
+      </w:tr>
     </w:tbl>
     <w:p>
       <w:pPr>
@@ -12798,7 +12876,30 @@
       </w:rPr>
       <w:t xml:space="preserve">Page </w:t>
     </w:r>
-    <w:pgNum/>
+    <w:r>
+      <w:rPr>
+        <w:color w:val="595959"/>
+        <w:sz w:val="18"/>
+        <w:szCs w:val="18"/>
+      </w:rPr>
+      <w:fldChar w:fldCharType="begin"/>
+    </w:r>
+    <w:r>
+      <w:rPr>
+        <w:color w:val="595959"/>
+        <w:sz w:val="18"/>
+        <w:szCs w:val="18"/>
+      </w:rPr>
+      <w:instrText xml:space="preserve"> PAGE </w:instrText>
+    </w:r>
+    <w:r>
+      <w:rPr>
+        <w:color w:val="595959"/>
+        <w:sz w:val="18"/>
+        <w:szCs w:val="18"/>
+      </w:rPr>
+      <w:fldChar w:fldCharType="end"/>
+    </w:r>
   </w:p>
 </w:ftr>
 </file>

</xml_diff>

<commit_message>
fix: auto-populate shelf_location from planogram grid; update changelog v2.3-v2.5
- detection.py: _pipeline_inventory_upsert now captures grid_row/grid_col
  from enriched detections and writes R{row}C{col} as shelf_location
- Retail_AI_Capstone_Report.docx: added v2.3, v2.4, v2.5 change log rows
</commit_message>
<xml_diff>
--- a/Retail_AI_Capstone_Report.docx
+++ b/Retail_AI_Capstone_Report.docx
@@ -12392,6 +12392,240 @@
                 <w:szCs w:val="20"/>
               </w:rPr>
               <w:t xml:space="preserve">Detection page groups results by category showing qty per product. Name and category editable inline. InventoryPage adds PATCH endpoint for name/category/threshold. Planogram table view shows editable Depth column per row.</w:t>
+            </w:r>
+          </w:p>
+        </w:tc>
+      </w:tr>
+      <w:tr>
+        <w:tc>
+          <w:tcPr>
+            <w:tcW w:type="dxa" w:w="800"/>
+            <w:shd w:fill="FFFFFF" w:color="auto" w:val="clear"/>
+            <w:vAlign w:val="center"/>
+          </w:tcPr>
+          <w:p>
+            <w:pPr>
+              <w:spacing w:after="30" w:before="30"/>
+            </w:pPr>
+            <w:r>
+              <w:rPr>
+                <w:sz w:val="20"/>
+                <w:szCs w:val="20"/>
+              </w:rPr>
+              <w:t xml:space="preserve">v2.3</w:t>
+            </w:r>
+          </w:p>
+        </w:tc>
+        <w:tc>
+          <w:tcPr>
+            <w:tcW w:type="dxa" w:w="2400"/>
+            <w:shd w:fill="FFFFFF" w:color="auto" w:val="clear"/>
+            <w:vAlign w:val="center"/>
+          </w:tcPr>
+          <w:p>
+            <w:pPr>
+              <w:spacing w:after="30" w:before="30"/>
+            </w:pPr>
+            <w:r>
+              <w:rPr>
+                <w:sz w:val="20"/>
+                <w:szCs w:val="20"/>
+              </w:rPr>
+              <w:t xml:space="preserve">Inventory: threshold + name/category editable by all users</w:t>
+            </w:r>
+          </w:p>
+        </w:tc>
+        <w:tc>
+          <w:tcPr>
+            <w:tcW w:type="dxa" w:w="2800"/>
+            <w:shd w:fill="FFFFFF" w:color="auto" w:val="clear"/>
+            <w:vAlign w:val="center"/>
+          </w:tcPr>
+          <w:p>
+            <w:pPr>
+              <w:spacing w:after="30" w:before="30"/>
+            </w:pPr>
+            <w:r>
+              <w:rPr>
+                <w:sz w:val="20"/>
+                <w:szCs w:val="20"/>
+              </w:rPr>
+              <w:t xml:space="preserve">InventoryPage.jsx, inventory.py</w:t>
+            </w:r>
+          </w:p>
+        </w:tc>
+        <w:tc>
+          <w:tcPr>
+            <w:tcW w:type="dxa" w:w="3360"/>
+            <w:shd w:fill="FFFFFF" w:color="auto" w:val="clear"/>
+            <w:vAlign w:val="center"/>
+          </w:tcPr>
+          <w:p>
+            <w:pPr>
+              <w:spacing w:after="30" w:before="30"/>
+            </w:pPr>
+            <w:r>
+              <w:rPr>
+                <w:sz w:val="20"/>
+                <w:szCs w:val="20"/>
+              </w:rPr>
+              <w:t xml:space="preserve">Added canPatch flag (any logged-in user). Actions column and Edit button now visible to all users. Edit button exposes inline inputs for product name, category, and low-stock threshold. Qty/location edit remains admin/manager only.</w:t>
+            </w:r>
+          </w:p>
+        </w:tc>
+      </w:tr>
+      <w:tr>
+        <w:tc>
+          <w:tcPr>
+            <w:tcW w:type="dxa" w:w="800"/>
+            <w:shd w:fill="FFFFFF" w:color="auto" w:val="clear"/>
+            <w:vAlign w:val="center"/>
+          </w:tcPr>
+          <w:p>
+            <w:pPr>
+              <w:spacing w:after="30" w:before="30"/>
+            </w:pPr>
+            <w:r>
+              <w:rPr>
+                <w:sz w:val="20"/>
+                <w:szCs w:val="20"/>
+              </w:rPr>
+              <w:t xml:space="preserve">v2.4</w:t>
+            </w:r>
+          </w:p>
+        </w:tc>
+        <w:tc>
+          <w:tcPr>
+            <w:tcW w:type="dxa" w:w="2400"/>
+            <w:shd w:fill="FFFFFF" w:color="auto" w:val="clear"/>
+            <w:vAlign w:val="center"/>
+          </w:tcPr>
+          <w:p>
+            <w:pPr>
+              <w:spacing w:after="30" w:before="30"/>
+            </w:pPr>
+            <w:r>
+              <w:rPr>
+                <w:sz w:val="20"/>
+                <w:szCs w:val="20"/>
+              </w:rPr>
+              <w:t xml:space="preserve">Detection: parallel bulk library save with live progress bar</w:t>
+            </w:r>
+          </w:p>
+        </w:tc>
+        <w:tc>
+          <w:tcPr>
+            <w:tcW w:type="dxa" w:w="2800"/>
+            <w:shd w:fill="FFFFFF" w:color="auto" w:val="clear"/>
+            <w:vAlign w:val="center"/>
+          </w:tcPr>
+          <w:p>
+            <w:pPr>
+              <w:spacing w:after="30" w:before="30"/>
+            </w:pPr>
+            <w:r>
+              <w:rPr>
+                <w:sz w:val="20"/>
+                <w:szCs w:val="20"/>
+              </w:rPr>
+              <w:t xml:space="preserve">Detection.jsx</w:t>
+            </w:r>
+          </w:p>
+        </w:tc>
+        <w:tc>
+          <w:tcPr>
+            <w:tcW w:type="dxa" w:w="3360"/>
+            <w:shd w:fill="FFFFFF" w:color="auto" w:val="clear"/>
+            <w:vAlign w:val="center"/>
+          </w:tcPr>
+          <w:p>
+            <w:pPr>
+              <w:spacing w:after="30" w:before="30"/>
+            </w:pPr>
+            <w:r>
+              <w:rPr>
+                <w:sz w:val="20"/>
+                <w:szCs w:val="20"/>
+              </w:rPr>
+              <w:t xml:space="preserve">Replaced sequential await with Promise.allSettled batches of 4 concurrent saves. Added libBulkProgress state driving an animated purple progress bar under Save All to Library showing saving X/N items in real time.</w:t>
+            </w:r>
+          </w:p>
+        </w:tc>
+      </w:tr>
+      <w:tr>
+        <w:tc>
+          <w:tcPr>
+            <w:tcW w:type="dxa" w:w="800"/>
+            <w:shd w:fill="FFFFFF" w:color="auto" w:val="clear"/>
+            <w:vAlign w:val="center"/>
+          </w:tcPr>
+          <w:p>
+            <w:pPr>
+              <w:spacing w:after="30" w:before="30"/>
+            </w:pPr>
+            <w:r>
+              <w:rPr>
+                <w:sz w:val="20"/>
+                <w:szCs w:val="20"/>
+              </w:rPr>
+              <w:t xml:space="preserve">v2.5</w:t>
+            </w:r>
+          </w:p>
+        </w:tc>
+        <w:tc>
+          <w:tcPr>
+            <w:tcW w:type="dxa" w:w="2400"/>
+            <w:shd w:fill="FFFFFF" w:color="auto" w:val="clear"/>
+            <w:vAlign w:val="center"/>
+          </w:tcPr>
+          <w:p>
+            <w:pPr>
+              <w:spacing w:after="30" w:before="30"/>
+            </w:pPr>
+            <w:r>
+              <w:rPr>
+                <w:sz w:val="20"/>
+                <w:szCs w:val="20"/>
+              </w:rPr>
+              <w:t xml:space="preserve">Inventory: shelf location auto-populated from planogram grid</w:t>
+            </w:r>
+          </w:p>
+        </w:tc>
+        <w:tc>
+          <w:tcPr>
+            <w:tcW w:type="dxa" w:w="2800"/>
+            <w:shd w:fill="FFFFFF" w:color="auto" w:val="clear"/>
+            <w:vAlign w:val="center"/>
+          </w:tcPr>
+          <w:p>
+            <w:pPr>
+              <w:spacing w:after="30" w:before="30"/>
+            </w:pPr>
+            <w:r>
+              <w:rPr>
+                <w:sz w:val="20"/>
+                <w:szCs w:val="20"/>
+              </w:rPr>
+              <w:t xml:space="preserve">detection.py</w:t>
+            </w:r>
+          </w:p>
+        </w:tc>
+        <w:tc>
+          <w:tcPr>
+            <w:tcW w:type="dxa" w:w="3360"/>
+            <w:shd w:fill="FFFFFF" w:color="auto" w:val="clear"/>
+            <w:vAlign w:val="center"/>
+          </w:tcPr>
+          <w:p>
+            <w:pPr>
+              <w:spacing w:after="30" w:before="30"/>
+            </w:pPr>
+            <w:r>
+              <w:rPr>
+                <w:sz w:val="20"/>
+                <w:szCs w:val="20"/>
+              </w:rPr>
+              <w:t xml:space="preserve">Fixed shelf_location always blank. _pipeline_inventory_upsert now captures grid_row/grid_col from enriched detections and writes R{row}C{col} as shelf_location when creating or updating inventory records.</w:t>
             </w:r>
           </w:p>
         </w:tc>

</xml_diff>